<commit_message>
update VO and added hints
</commit_message>
<xml_diff>
--- a/TDS/lab1/lab steps.docx
+++ b/TDS/lab1/lab steps.docx
@@ -41,7 +41,24 @@
         <w:contextualSpacing w:val="0"/>
       </w:pPr>
       <w:r>
-        <w:t xml:space="preserve">From the navigation drop-down at the top center, choose Explore, then select the </w:t>
+        <w:t xml:space="preserve">From the navigation drop-down at the top center, choose Explore, </w:t>
+      </w:r>
+    </w:p>
+    <w:p>
+      <w:pPr>
+        <w:pStyle w:val="ListParagraph"/>
+        <w:numPr>
+          <w:ilvl w:val="0"/>
+          <w:numId w:val="1"/>
+        </w:numPr>
+        <w:spacing w:after="200"/>
+        <w:contextualSpacing w:val="0"/>
+      </w:pPr>
+      <w:r>
+        <w:t>S</w:t>
+      </w:r>
+      <w:r>
+        <w:t xml:space="preserve">elect the </w:t>
       </w:r>
       <w:proofErr w:type="gramStart"/>
       <w:r>
@@ -139,6 +156,12 @@
         </w:rPr>
         <w:t xml:space="preserve"> </w:t>
       </w:r>
+      <w:r>
+        <w:rPr>
+          <w:noProof/>
+        </w:rPr>
+        <w:t>Close device information panel</w:t>
+      </w:r>
     </w:p>
     <w:p>
       <w:pPr>
@@ -153,6 +176,9 @@
       <w:r>
         <w:t>In the view toggle at the top, switch from Map to Activity list. Click the first row to inspect its details.</w:t>
       </w:r>
+      <w:r>
+        <w:t xml:space="preserve"> Close panel</w:t>
+      </w:r>
     </w:p>
     <w:p>
       <w:pPr>
@@ -193,10 +219,32 @@
         <w:contextualSpacing w:val="0"/>
       </w:pPr>
       <w:r>
-        <w:t>Click a blue line between two devices, then click Flows at the bottom right to view packet-level details. Close the window when finished.</w:t>
+        <w:t>Click a blue line between two devices</w:t>
+      </w:r>
+      <w:r>
+        <w:t>.</w:t>
+      </w:r>
+      <w:r>
+        <w:t xml:space="preserve"> </w:t>
       </w:r>
     </w:p>
-    <w:p/>
+    <w:p>
+      <w:pPr>
+        <w:pStyle w:val="ListParagraph"/>
+        <w:numPr>
+          <w:ilvl w:val="0"/>
+          <w:numId w:val="1"/>
+        </w:numPr>
+        <w:spacing w:after="80"/>
+        <w:contextualSpacing w:val="0"/>
+      </w:pPr>
+      <w:r>
+        <w:t xml:space="preserve">Now </w:t>
+      </w:r>
+      <w:r>
+        <w:t xml:space="preserve">click Flows at the bottom right to view packet-level details. </w:t>
+      </w:r>
+    </w:p>
     <w:sectPr>
       <w:pgSz w:w="12240" w:h="15840"/>
       <w:pgMar w:top="1440" w:right="1440" w:bottom="1440" w:left="1440" w:header="720" w:footer="720" w:gutter="0"/>

</xml_diff>